<commit_message>
Add e-filing to the criminal docketing statement
Also fixes a missing quote in al_person_answering_labels and the old
filer_role/pro_se variables in the docx template.
</commit_message>
<xml_diff>
--- a/docassemble/CriminalDocketingStatement/data/templates/criminal_docketing_statement.docx
+++ b/docassemble/CriminalDocketingStatement/data/templates/criminal_docketing_statement.docx
@@ -826,7 +826,92 @@
           <w:sz w:val="20"/>
         </w:rPr>
         <w:tab/>
-        <w:t>{{ client.name.full() if filer_role == “attorney” else users[0].name.full() }}</w:t>
+      </w:r>
+      <w:proofErr w:type="gramStart"/>
+      <w:r>
+        <w:rPr>
+          <w:sz w:val="20"/>
+        </w:rPr>
+        <w:t xml:space="preserve">{{ </w:t>
+      </w:r>
+      <w:proofErr w:type="spellStart"/>
+      <w:r>
+        <w:rPr>
+          <w:sz w:val="20"/>
+        </w:rPr>
+        <w:t>client.name</w:t>
+      </w:r>
+      <w:proofErr w:type="gramEnd"/>
+      <w:r>
+        <w:rPr>
+          <w:sz w:val="20"/>
+        </w:rPr>
+        <w:t>.</w:t>
+      </w:r>
+      <w:proofErr w:type="gramStart"/>
+      <w:r>
+        <w:rPr>
+          <w:sz w:val="20"/>
+        </w:rPr>
+        <w:t>full</w:t>
+      </w:r>
+      <w:proofErr w:type="spellEnd"/>
+      <w:r>
+        <w:rPr>
+          <w:sz w:val="20"/>
+        </w:rPr>
+        <w:t>(</w:t>
+      </w:r>
+      <w:proofErr w:type="gramEnd"/>
+      <w:r>
+        <w:rPr>
+          <w:sz w:val="20"/>
+        </w:rPr>
+        <w:t xml:space="preserve">) if </w:t>
+      </w:r>
+      <w:proofErr w:type="spellStart"/>
+      <w:r>
+        <w:rPr>
+          <w:sz w:val="20"/>
+        </w:rPr>
+        <w:t>al_person_answering</w:t>
+      </w:r>
+      <w:proofErr w:type="spellEnd"/>
+      <w:r>
+        <w:rPr>
+          <w:sz w:val="20"/>
+        </w:rPr>
+        <w:t xml:space="preserve"> == “attorney” else users[0].</w:t>
+      </w:r>
+      <w:proofErr w:type="spellStart"/>
+      <w:proofErr w:type="gramStart"/>
+      <w:r>
+        <w:rPr>
+          <w:sz w:val="20"/>
+        </w:rPr>
+        <w:t>name.full</w:t>
+      </w:r>
+      <w:proofErr w:type="spellEnd"/>
+      <w:proofErr w:type="gramEnd"/>
+      <w:r>
+        <w:rPr>
+          <w:sz w:val="20"/>
+        </w:rPr>
+        <w:t>(</w:t>
+      </w:r>
+      <w:proofErr w:type="gramStart"/>
+      <w:r>
+        <w:rPr>
+          <w:sz w:val="20"/>
+        </w:rPr>
+        <w:t>) }</w:t>
+      </w:r>
+      <w:proofErr w:type="gramEnd"/>
+      <w:r>
+        <w:rPr>
+          <w:sz w:val="20"/>
+        </w:rPr>
+        <w:t>}</w:t>
       </w:r>
     </w:p>
     <w:p>
@@ -928,12 +1013,69 @@
                                 <w:szCs w:val="20"/>
                               </w:rPr>
                             </w:pPr>
+                            <w:proofErr w:type="gramStart"/>
                             <w:r>
                               <w:rPr>
                                 <w:sz w:val="20"/>
                                 <w:szCs w:val="20"/>
                               </w:rPr>
-                              <w:t>{{ attorney_bbo if filer_role == "attorney" else "N/A" }}</w:t>
+                              <w:t xml:space="preserve">{{ </w:t>
+                            </w:r>
+                            <w:proofErr w:type="spellStart"/>
+                            <w:r>
+                              <w:rPr>
+                                <w:sz w:val="20"/>
+                                <w:szCs w:val="20"/>
+                              </w:rPr>
+                              <w:t>attorney</w:t>
+                            </w:r>
+                            <w:proofErr w:type="gramEnd"/>
+                            <w:r>
+                              <w:rPr>
+                                <w:sz w:val="20"/>
+                                <w:szCs w:val="20"/>
+                              </w:rPr>
+                              <w:t>_bbo</w:t>
+                            </w:r>
+                            <w:proofErr w:type="spellEnd"/>
+                            <w:r>
+                              <w:rPr>
+                                <w:sz w:val="20"/>
+                                <w:szCs w:val="20"/>
+                              </w:rPr>
+                              <w:t xml:space="preserve"> if </w:t>
+                            </w:r>
+                            <w:proofErr w:type="spellStart"/>
+                            <w:r>
+                              <w:rPr>
+                                <w:sz w:val="20"/>
+                                <w:szCs w:val="20"/>
+                              </w:rPr>
+                              <w:t>al_person_answering</w:t>
+                            </w:r>
+                            <w:proofErr w:type="spellEnd"/>
+                            <w:r>
+                              <w:rPr>
+                                <w:sz w:val="20"/>
+                                <w:szCs w:val="20"/>
+                              </w:rPr>
+                              <w:t xml:space="preserve"> == “attorney” else “N/A</w:t>
+                            </w:r>
+                            <w:proofErr w:type="gramStart"/>
+                            <w:r>
+                              <w:rPr>
+                                <w:sz w:val="20"/>
+                                <w:szCs w:val="20"/>
+                              </w:rPr>
+                              <w:t>” }</w:t>
+                            </w:r>
+                            <w:proofErr w:type="gramEnd"/>
+                            <w:r>
+                              <w:rPr>
+                                <w:sz w:val="20"/>
+                                <w:szCs w:val="20"/>
+                              </w:rPr>
+                              <w:t>}</w:t>
                             </w:r>
                           </w:p>
                           <w:p>
@@ -963,7 +1105,11 @@
           </mc:Choice>
           <mc:Fallback>
             <w:pict>
-              <v:shape w14:anchorId="298A1347" id="Text Box 49" o:spid="_x0000_s1028" type="#_x0000_t202" style="position:absolute;margin-left:329pt;margin-top:6.6pt;width:242.75pt;height:20.3pt;z-index:487608832;visibility:visible;mso-wrap-style:square;mso-height-percent:0;mso-wrap-distance-left:9pt;mso-wrap-distance-top:0;mso-wrap-distance-right:9pt;mso-wrap-distance-bottom:0;mso-position-horizontal:absolute;mso-position-horizontal-relative:text;mso-position-vertical:absolute;mso-position-vertical-relative:text;mso-height-percent:0;mso-height-relative:margin;v-text-anchor:top" o:gfxdata="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" fillcolor="white [3201]" stroked="f" strokeweight=".5pt">
+              <v:shapetype w14:anchorId="298A1347" id="_x0000_t202" coordsize="21600,21600" o:spt="202" path="m,l,21600r21600,l21600,xe">
+                <v:stroke joinstyle="miter"/>
+                <v:path gradientshapeok="t" o:connecttype="rect"/>
+              </v:shapetype>
+              <v:shape id="Text Box 49" o:spid="_x0000_s1028" type="#_x0000_t202" style="position:absolute;margin-left:329pt;margin-top:6.6pt;width:242.75pt;height:20.3pt;z-index:487608832;visibility:visible;mso-wrap-style:square;mso-height-percent:0;mso-wrap-distance-left:9pt;mso-wrap-distance-top:0;mso-wrap-distance-right:9pt;mso-wrap-distance-bottom:0;mso-position-horizontal:absolute;mso-position-horizontal-relative:text;mso-position-vertical:absolute;mso-position-vertical-relative:text;mso-height-percent:0;mso-height-relative:margin;v-text-anchor:top" o:gfxdata="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" fillcolor="white [3201]" stroked="f" strokeweight=".5pt">
                 <v:textbox>
                   <w:txbxContent>
                     <w:p>
@@ -973,12 +1119,69 @@
                           <w:szCs w:val="20"/>
                         </w:rPr>
                       </w:pPr>
+                      <w:proofErr w:type="gramStart"/>
                       <w:r>
                         <w:rPr>
                           <w:sz w:val="20"/>
                           <w:szCs w:val="20"/>
                         </w:rPr>
-                        <w:t>{{ attorney_bbo if filer_role == "attorney" else "N/A" }}</w:t>
+                        <w:t xml:space="preserve">{{ </w:t>
+                      </w:r>
+                      <w:proofErr w:type="spellStart"/>
+                      <w:r>
+                        <w:rPr>
+                          <w:sz w:val="20"/>
+                          <w:szCs w:val="20"/>
+                        </w:rPr>
+                        <w:t>attorney</w:t>
+                      </w:r>
+                      <w:proofErr w:type="gramEnd"/>
+                      <w:r>
+                        <w:rPr>
+                          <w:sz w:val="20"/>
+                          <w:szCs w:val="20"/>
+                        </w:rPr>
+                        <w:t>_bbo</w:t>
+                      </w:r>
+                      <w:proofErr w:type="spellEnd"/>
+                      <w:r>
+                        <w:rPr>
+                          <w:sz w:val="20"/>
+                          <w:szCs w:val="20"/>
+                        </w:rPr>
+                        <w:t xml:space="preserve"> if </w:t>
+                      </w:r>
+                      <w:proofErr w:type="spellStart"/>
+                      <w:r>
+                        <w:rPr>
+                          <w:sz w:val="20"/>
+                          <w:szCs w:val="20"/>
+                        </w:rPr>
+                        <w:t>al_person_answering</w:t>
+                      </w:r>
+                      <w:proofErr w:type="spellEnd"/>
+                      <w:r>
+                        <w:rPr>
+                          <w:sz w:val="20"/>
+                          <w:szCs w:val="20"/>
+                        </w:rPr>
+                        <w:t xml:space="preserve"> == “attorney” else “N/A</w:t>
+                      </w:r>
+                      <w:proofErr w:type="gramStart"/>
+                      <w:r>
+                        <w:rPr>
+                          <w:sz w:val="20"/>
+                          <w:szCs w:val="20"/>
+                        </w:rPr>
+                        <w:t>” }</w:t>
+                      </w:r>
+                      <w:proofErr w:type="gramEnd"/>
+                      <w:r>
+                        <w:rPr>
+                          <w:sz w:val="20"/>
+                          <w:szCs w:val="20"/>
+                        </w:rPr>
+                        <w:t>}</w:t>
                       </w:r>
                     </w:p>
                     <w:p>
@@ -1046,12 +1249,71 @@
                                 <w:szCs w:val="20"/>
                               </w:rPr>
                             </w:pPr>
+                            <w:proofErr w:type="gramStart"/>
                             <w:r>
                               <w:rPr>
                                 <w:sz w:val="20"/>
                                 <w:szCs w:val="20"/>
                               </w:rPr>
-                              <w:t>{{ users[0].name.full() if filer_role == "attorney" else “N/A” }}</w:t>
+                              <w:t>{{ users</w:t>
+                            </w:r>
+                            <w:proofErr w:type="gramEnd"/>
+                            <w:r>
+                              <w:rPr>
+                                <w:sz w:val="20"/>
+                                <w:szCs w:val="20"/>
+                              </w:rPr>
+                              <w:t>[0].</w:t>
+                            </w:r>
+                            <w:proofErr w:type="spellStart"/>
+                            <w:proofErr w:type="gramStart"/>
+                            <w:r>
+                              <w:rPr>
+                                <w:sz w:val="20"/>
+                                <w:szCs w:val="20"/>
+                              </w:rPr>
+                              <w:t>name.full</w:t>
+                            </w:r>
+                            <w:proofErr w:type="spellEnd"/>
+                            <w:proofErr w:type="gramEnd"/>
+                            <w:r>
+                              <w:rPr>
+                                <w:sz w:val="20"/>
+                                <w:szCs w:val="20"/>
+                              </w:rPr>
+                              <w:t xml:space="preserve">() if </w:t>
+                            </w:r>
+                            <w:proofErr w:type="spellStart"/>
+                            <w:r>
+                              <w:rPr>
+                                <w:sz w:val="20"/>
+                                <w:szCs w:val="20"/>
+                              </w:rPr>
+                              <w:t>al_person_answering</w:t>
+                            </w:r>
+                            <w:proofErr w:type="spellEnd"/>
+                            <w:r>
+                              <w:rPr>
+                                <w:sz w:val="20"/>
+                                <w:szCs w:val="20"/>
+                              </w:rPr>
+                              <w:t xml:space="preserve"> == “attorney” else “N/A</w:t>
+                            </w:r>
+                            <w:proofErr w:type="gramStart"/>
+                            <w:r>
+                              <w:rPr>
+                                <w:sz w:val="20"/>
+                                <w:szCs w:val="20"/>
+                              </w:rPr>
+                              <w:t>” }</w:t>
+                            </w:r>
+                            <w:proofErr w:type="gramEnd"/>
+                            <w:r>
+                              <w:rPr>
+                                <w:sz w:val="20"/>
+                                <w:szCs w:val="20"/>
+                              </w:rPr>
+                              <w:t>}</w:t>
                             </w:r>
                           </w:p>
                         </w:txbxContent>
@@ -1083,12 +1345,71 @@
                           <w:szCs w:val="20"/>
                         </w:rPr>
                       </w:pPr>
+                      <w:proofErr w:type="gramStart"/>
                       <w:r>
                         <w:rPr>
                           <w:sz w:val="20"/>
                           <w:szCs w:val="20"/>
                         </w:rPr>
-                        <w:t>{{ users[0].name.full() if filer_role == "attorney" else “N/A” }}</w:t>
+                        <w:t>{{ users</w:t>
+                      </w:r>
+                      <w:proofErr w:type="gramEnd"/>
+                      <w:r>
+                        <w:rPr>
+                          <w:sz w:val="20"/>
+                          <w:szCs w:val="20"/>
+                        </w:rPr>
+                        <w:t>[0].</w:t>
+                      </w:r>
+                      <w:proofErr w:type="spellStart"/>
+                      <w:proofErr w:type="gramStart"/>
+                      <w:r>
+                        <w:rPr>
+                          <w:sz w:val="20"/>
+                          <w:szCs w:val="20"/>
+                        </w:rPr>
+                        <w:t>name.full</w:t>
+                      </w:r>
+                      <w:proofErr w:type="spellEnd"/>
+                      <w:proofErr w:type="gramEnd"/>
+                      <w:r>
+                        <w:rPr>
+                          <w:sz w:val="20"/>
+                          <w:szCs w:val="20"/>
+                        </w:rPr>
+                        <w:t xml:space="preserve">() if </w:t>
+                      </w:r>
+                      <w:proofErr w:type="spellStart"/>
+                      <w:r>
+                        <w:rPr>
+                          <w:sz w:val="20"/>
+                          <w:szCs w:val="20"/>
+                        </w:rPr>
+                        <w:t>al_person_answering</w:t>
+                      </w:r>
+                      <w:proofErr w:type="spellEnd"/>
+                      <w:r>
+                        <w:rPr>
+                          <w:sz w:val="20"/>
+                          <w:szCs w:val="20"/>
+                        </w:rPr>
+                        <w:t xml:space="preserve"> == “attorney” else “N/A</w:t>
+                      </w:r>
+                      <w:proofErr w:type="gramStart"/>
+                      <w:r>
+                        <w:rPr>
+                          <w:sz w:val="20"/>
+                          <w:szCs w:val="20"/>
+                        </w:rPr>
+                        <w:t>” }</w:t>
+                      </w:r>
+                      <w:proofErr w:type="gramEnd"/>
+                      <w:r>
+                        <w:rPr>
+                          <w:sz w:val="20"/>
+                          <w:szCs w:val="20"/>
+                        </w:rPr>
+                        <w:t>}</w:t>
                       </w:r>
                     </w:p>
                   </w:txbxContent>
@@ -1227,12 +1548,71 @@
                                 <w:szCs w:val="20"/>
                               </w:rPr>
                             </w:pPr>
+                            <w:proofErr w:type="gramStart"/>
                             <w:r>
                               <w:rPr>
                                 <w:sz w:val="20"/>
                                 <w:szCs w:val="20"/>
                               </w:rPr>
-                              <w:t>{{ users[0].name.full() if filer_role == "pro_se" else "N/A" }}</w:t>
+                              <w:t>{{ users</w:t>
+                            </w:r>
+                            <w:proofErr w:type="gramEnd"/>
+                            <w:r>
+                              <w:rPr>
+                                <w:sz w:val="20"/>
+                                <w:szCs w:val="20"/>
+                              </w:rPr>
+                              <w:t>[0].</w:t>
+                            </w:r>
+                            <w:proofErr w:type="spellStart"/>
+                            <w:proofErr w:type="gramStart"/>
+                            <w:r>
+                              <w:rPr>
+                                <w:sz w:val="20"/>
+                                <w:szCs w:val="20"/>
+                              </w:rPr>
+                              <w:t>name.full</w:t>
+                            </w:r>
+                            <w:proofErr w:type="spellEnd"/>
+                            <w:proofErr w:type="gramEnd"/>
+                            <w:r>
+                              <w:rPr>
+                                <w:sz w:val="20"/>
+                                <w:szCs w:val="20"/>
+                              </w:rPr>
+                              <w:t xml:space="preserve">() if </w:t>
+                            </w:r>
+                            <w:proofErr w:type="spellStart"/>
+                            <w:r>
+                              <w:rPr>
+                                <w:sz w:val="20"/>
+                                <w:szCs w:val="20"/>
+                              </w:rPr>
+                              <w:t>al_person_answering</w:t>
+                            </w:r>
+                            <w:proofErr w:type="spellEnd"/>
+                            <w:r>
+                              <w:rPr>
+                                <w:sz w:val="20"/>
+                                <w:szCs w:val="20"/>
+                              </w:rPr>
+                              <w:t xml:space="preserve"> == “user” else “N/A</w:t>
+                            </w:r>
+                            <w:proofErr w:type="gramStart"/>
+                            <w:r>
+                              <w:rPr>
+                                <w:sz w:val="20"/>
+                                <w:szCs w:val="20"/>
+                              </w:rPr>
+                              <w:t>” }</w:t>
+                            </w:r>
+                            <w:proofErr w:type="gramEnd"/>
+                            <w:r>
+                              <w:rPr>
+                                <w:sz w:val="20"/>
+                                <w:szCs w:val="20"/>
+                              </w:rPr>
+                              <w:t>}</w:t>
                             </w:r>
                           </w:p>
                           <w:p>
@@ -1275,12 +1655,71 @@
                           <w:szCs w:val="20"/>
                         </w:rPr>
                       </w:pPr>
+                      <w:proofErr w:type="gramStart"/>
                       <w:r>
                         <w:rPr>
                           <w:sz w:val="20"/>
                           <w:szCs w:val="20"/>
                         </w:rPr>
-                        <w:t>{{ users[0].name.full() if filer_role == "pro_se" else "N/A" }}</w:t>
+                        <w:t>{{ users</w:t>
+                      </w:r>
+                      <w:proofErr w:type="gramEnd"/>
+                      <w:r>
+                        <w:rPr>
+                          <w:sz w:val="20"/>
+                          <w:szCs w:val="20"/>
+                        </w:rPr>
+                        <w:t>[0].</w:t>
+                      </w:r>
+                      <w:proofErr w:type="spellStart"/>
+                      <w:proofErr w:type="gramStart"/>
+                      <w:r>
+                        <w:rPr>
+                          <w:sz w:val="20"/>
+                          <w:szCs w:val="20"/>
+                        </w:rPr>
+                        <w:t>name.full</w:t>
+                      </w:r>
+                      <w:proofErr w:type="spellEnd"/>
+                      <w:proofErr w:type="gramEnd"/>
+                      <w:r>
+                        <w:rPr>
+                          <w:sz w:val="20"/>
+                          <w:szCs w:val="20"/>
+                        </w:rPr>
+                        <w:t xml:space="preserve">() if </w:t>
+                      </w:r>
+                      <w:proofErr w:type="spellStart"/>
+                      <w:r>
+                        <w:rPr>
+                          <w:sz w:val="20"/>
+                          <w:szCs w:val="20"/>
+                        </w:rPr>
+                        <w:t>al_person_answering</w:t>
+                      </w:r>
+                      <w:proofErr w:type="spellEnd"/>
+                      <w:r>
+                        <w:rPr>
+                          <w:sz w:val="20"/>
+                          <w:szCs w:val="20"/>
+                        </w:rPr>
+                        <w:t xml:space="preserve"> == “user” else “N/A</w:t>
+                      </w:r>
+                      <w:proofErr w:type="gramStart"/>
+                      <w:r>
+                        <w:rPr>
+                          <w:sz w:val="20"/>
+                          <w:szCs w:val="20"/>
+                        </w:rPr>
+                        <w:t>” }</w:t>
+                      </w:r>
+                      <w:proofErr w:type="gramEnd"/>
+                      <w:r>
+                        <w:rPr>
+                          <w:sz w:val="20"/>
+                          <w:szCs w:val="20"/>
+                        </w:rPr>
+                        <w:t>}</w:t>
                       </w:r>
                     </w:p>
                     <w:p>
@@ -1306,24 +1745,40 @@
           <w:sz w:val="20"/>
         </w:rPr>
       </w:pPr>
-      <w:r>
-        <w:rPr>
-          <w:sz w:val="20"/>
-        </w:rPr>
-        <w:t>{{ "</w:t>
-      </w:r>
+      <w:proofErr w:type="gramStart"/>
+      <w:r>
+        <w:rPr>
+          <w:sz w:val="20"/>
+        </w:rPr>
+        <w:t>{{ “</w:t>
+      </w:r>
+      <w:proofErr w:type="gramEnd"/>
       <w:r>
         <w:rPr>
           <w:rFonts w:ascii="Segoe UI Symbol" w:hAnsi="Segoe UI Symbol" w:cs="Segoe UI Symbol"/>
           <w:sz w:val="20"/>
         </w:rPr>
-        <w:t xml:space="preserve">☒” </w:t>
-      </w:r>
-      <w:r>
-        <w:rPr>
-          <w:sz w:val="20"/>
-        </w:rPr>
-        <w:t>if filer_role == "pro_se" else "</w:t>
+        <w:t>☒</w:t>
+      </w:r>
+      <w:r>
+        <w:rPr>
+          <w:sz w:val="20"/>
+        </w:rPr>
+        <w:t xml:space="preserve">” if </w:t>
+      </w:r>
+      <w:proofErr w:type="spellStart"/>
+      <w:r>
+        <w:rPr>
+          <w:sz w:val="20"/>
+        </w:rPr>
+        <w:t>al_person_answering</w:t>
+      </w:r>
+      <w:proofErr w:type="spellEnd"/>
+      <w:r>
+        <w:rPr>
+          <w:sz w:val="20"/>
+        </w:rPr>
+        <w:t xml:space="preserve"> == “user” else “</w:t>
       </w:r>
       <w:r>
         <w:rPr>
@@ -1332,11 +1787,19 @@
         </w:rPr>
         <w:t>☐</w:t>
       </w:r>
-      <w:r>
-        <w:rPr>
-          <w:sz w:val="20"/>
-        </w:rPr>
-        <w:t>" }}</w:t>
+      <w:proofErr w:type="gramStart"/>
+      <w:r>
+        <w:rPr>
+          <w:sz w:val="20"/>
+        </w:rPr>
+        <w:t>” }</w:t>
+      </w:r>
+      <w:proofErr w:type="gramEnd"/>
+      <w:r>
+        <w:rPr>
+          <w:sz w:val="20"/>
+        </w:rPr>
+        <w:t>}</w:t>
       </w:r>
       <w:r>
         <w:rPr>
@@ -6962,12 +7425,69 @@
         </w:rPr>
         <w:tab/>
       </w:r>
+      <w:proofErr w:type="gramStart"/>
       <w:r>
         <w:rPr>
           <w:sz w:val="20"/>
           <w:szCs w:val="20"/>
         </w:rPr>
-        <w:t>{{ attorney_bbo if filer_role == "attorney" else "N/A" }}</w:t>
+        <w:t xml:space="preserve">{{ </w:t>
+      </w:r>
+      <w:proofErr w:type="spellStart"/>
+      <w:r>
+        <w:rPr>
+          <w:sz w:val="20"/>
+          <w:szCs w:val="20"/>
+        </w:rPr>
+        <w:t>attorney</w:t>
+      </w:r>
+      <w:proofErr w:type="gramEnd"/>
+      <w:r>
+        <w:rPr>
+          <w:sz w:val="20"/>
+          <w:szCs w:val="20"/>
+        </w:rPr>
+        <w:t>_bbo</w:t>
+      </w:r>
+      <w:proofErr w:type="spellEnd"/>
+      <w:r>
+        <w:rPr>
+          <w:sz w:val="20"/>
+          <w:szCs w:val="20"/>
+        </w:rPr>
+        <w:t xml:space="preserve"> if </w:t>
+      </w:r>
+      <w:proofErr w:type="spellStart"/>
+      <w:r>
+        <w:rPr>
+          <w:sz w:val="20"/>
+          <w:szCs w:val="20"/>
+        </w:rPr>
+        <w:t>al_person_answering</w:t>
+      </w:r>
+      <w:proofErr w:type="spellEnd"/>
+      <w:r>
+        <w:rPr>
+          <w:sz w:val="20"/>
+          <w:szCs w:val="20"/>
+        </w:rPr>
+        <w:t xml:space="preserve"> == “attorney” else “N/A</w:t>
+      </w:r>
+      <w:proofErr w:type="gramStart"/>
+      <w:r>
+        <w:rPr>
+          <w:sz w:val="20"/>
+          <w:szCs w:val="20"/>
+        </w:rPr>
+        <w:t>” }</w:t>
+      </w:r>
+      <w:proofErr w:type="gramEnd"/>
+      <w:r>
+        <w:rPr>
+          <w:sz w:val="20"/>
+          <w:szCs w:val="20"/>
+        </w:rPr>
+        <w:t>}</w:t>
       </w:r>
     </w:p>
     <w:p>
@@ -7298,20 +7818,104 @@
           <w:sz w:val="20"/>
         </w:rPr>
       </w:pPr>
+      <w:proofErr w:type="gramStart"/>
       <w:r>
         <w:rPr>
           <w:sz w:val="20"/>
           <w:u w:val="single"/>
         </w:rPr>
-        <w:t>{{ client.name.full() if filer_role == “attorney” else users[0].name.full() }}</w:t>
-      </w:r>
+        <w:t xml:space="preserve">{{ </w:t>
+      </w:r>
+      <w:proofErr w:type="spellStart"/>
       <w:r>
         <w:rPr>
           <w:sz w:val="20"/>
           <w:u w:val="single"/>
         </w:rPr>
+        <w:t>client.name</w:t>
+      </w:r>
+      <w:proofErr w:type="gramEnd"/>
+      <w:r>
+        <w:rPr>
+          <w:sz w:val="20"/>
+          <w:u w:val="single"/>
+        </w:rPr>
+        <w:t>.</w:t>
+      </w:r>
+      <w:proofErr w:type="gramStart"/>
+      <w:r>
+        <w:rPr>
+          <w:sz w:val="20"/>
+          <w:u w:val="single"/>
+        </w:rPr>
+        <w:t>full</w:t>
+      </w:r>
+      <w:proofErr w:type="spellEnd"/>
+      <w:r>
+        <w:rPr>
+          <w:sz w:val="20"/>
+          <w:u w:val="single"/>
+        </w:rPr>
+        <w:t>(</w:t>
+      </w:r>
+      <w:proofErr w:type="gramEnd"/>
+      <w:r>
+        <w:rPr>
+          <w:sz w:val="20"/>
+          <w:u w:val="single"/>
+        </w:rPr>
+        <w:t xml:space="preserve">) if </w:t>
+      </w:r>
+      <w:proofErr w:type="spellStart"/>
+      <w:r>
+        <w:rPr>
+          <w:sz w:val="20"/>
+          <w:u w:val="single"/>
+        </w:rPr>
+        <w:t>al_person_answering</w:t>
+      </w:r>
+      <w:proofErr w:type="spellEnd"/>
+      <w:r>
+        <w:rPr>
+          <w:sz w:val="20"/>
+          <w:u w:val="single"/>
+        </w:rPr>
+        <w:t xml:space="preserve"> == “attorney” else users[0].</w:t>
+      </w:r>
+      <w:proofErr w:type="spellStart"/>
+      <w:proofErr w:type="gramStart"/>
+      <w:r>
+        <w:rPr>
+          <w:sz w:val="20"/>
+          <w:u w:val="single"/>
+        </w:rPr>
+        <w:t>name.full</w:t>
+      </w:r>
+      <w:proofErr w:type="spellEnd"/>
+      <w:proofErr w:type="gramEnd"/>
+      <w:r>
+        <w:rPr>
+          <w:sz w:val="20"/>
+          <w:u w:val="single"/>
+        </w:rPr>
+        <w:t>(</w:t>
+      </w:r>
+      <w:proofErr w:type="gramStart"/>
+      <w:r>
+        <w:rPr>
+          <w:sz w:val="20"/>
+          <w:u w:val="single"/>
+        </w:rPr>
+        <w:t>) }}</w:t>
+      </w:r>
+      <w:r>
+        <w:rPr>
+          <w:sz w:val="20"/>
+          <w:u w:val="single"/>
+        </w:rPr>
         <w:tab/>
       </w:r>
+      <w:proofErr w:type="gramEnd"/>
       <w:r>
         <w:rPr>
           <w:spacing w:val="58"/>

</xml_diff>